<commit_message>
feat: settings page (school/dept/logo), filiere-selective exports, single-page PV
- CHANGE 4: /settings page to configure school name, department and logo
  - configurations table now key/value; Configuration model with get/set + logo helpers
  - ConfigurationController (index/update + logo upload) replaces SettingsController
  - dynamic header (school/dept/logo) in PDF + Word + PV exports (logo embedded as data URI for PDF)
- CHANGE 5: export modal on planning results with per-filiere checkboxes
  (select/deselect all) + custom session name; PDF/Word filtered to selected filieres
- CHANGE 6: PV header school name/department/logo dynamic; tighter margins + name
  truncation so the PV fits on a single page
</commit_message>
<xml_diff>
--- a/storage/template_pv.docx
+++ b/storage/template_pv.docx
@@ -4,6 +4,15 @@
   <w:body>
     <w:p>
       <w:pPr>
+        <w:jc w:val="center"/>
+        <w:spacing w:after="0" w:line="240" w:lineRule="auto"/>
+      </w:pPr>
+      <w:r>
+        <w:t>${school_logo}</w:t>
+      </w:r>
+    </w:p>
+    <w:p>
+      <w:pPr>
         <w:pStyle w:val="Title"/>
         <w:rPr>
           <w:u w:val="none"/>
@@ -36,7 +45,7 @@
         <w:rPr>
           <w:u w:val="none"/>
         </w:rPr>
-        <w:t xml:space="preserve">Département de Mathématiques et Informatique </w:t>
+        <w:t xml:space="preserve">${department_name}</w:t>
       </w:r>
     </w:p>
     <w:p>
@@ -1743,7 +1752,7 @@
     <w:sectPr>
       <w:headerReference w:type="default" r:id="rId7"/>
       <w:pgSz w:w="11906" w:h="16838"/>
-      <w:pgMar w:top="720" w:right="720" w:bottom="720" w:left="1584" w:header="708" w:footer="708" w:gutter="0"/>
+      <w:pgMar w:top="567" w:right="720" w:bottom="454" w:left="1418" w:header="708" w:footer="708" w:gutter="0"/>
       <w:cols w:space="708"/>
       <w:docGrid w:linePitch="360"/>
     </w:sectPr>
@@ -1966,39 +1975,7 @@
         <w:sz w:val="24"/>
         <w:szCs w:val="24"/>
       </w:rPr>
-      <w:t xml:space="preserve">      Ecole Nationale des Sciences Appliquées d’A</w:t>
-    </w:r>
-    <w:r>
-      <w:rPr>
-        <w:rFonts w:asciiTheme="majorBidi" w:hAnsiTheme="majorBidi" w:cstheme="majorBidi"/>
-        <w:sz w:val="24"/>
-        <w:szCs w:val="24"/>
-      </w:rPr>
-      <w:t>l-</w:t>
-    </w:r>
-    <w:r>
-      <w:rPr>
-        <w:rFonts w:asciiTheme="majorBidi" w:hAnsiTheme="majorBidi" w:cstheme="majorBidi"/>
-        <w:sz w:val="24"/>
-        <w:szCs w:val="24"/>
-      </w:rPr>
-      <w:t>Hoce</w:t>
-    </w:r>
-    <w:r>
-      <w:rPr>
-        <w:rFonts w:asciiTheme="majorBidi" w:hAnsiTheme="majorBidi" w:cstheme="majorBidi"/>
-        <w:sz w:val="24"/>
-        <w:szCs w:val="24"/>
-      </w:rPr>
-      <w:t>i</w:t>
-    </w:r>
-    <w:r>
-      <w:rPr>
-        <w:rFonts w:asciiTheme="majorBidi" w:hAnsiTheme="majorBidi" w:cstheme="majorBidi"/>
-        <w:sz w:val="24"/>
-        <w:szCs w:val="24"/>
-      </w:rPr>
-      <w:t>ma - Maroc</w:t>
+      <w:t xml:space="preserve">      ${school_name}</w:t>
     </w:r>
   </w:p>
   <w:p>

</xml_diff>